<commit_message>
court(vactapp): second pass on the shared model: amicus and answering engines regenerated, amicus finds on the titles (typst marked URL tails a page late), covers fill, answering conclusion kept with its signature; open items for the second serial lane (fb-595.54.67)
Co-Authored-By: Claude Opus 5.5 <noreply@anthropic.com>
</commit_message>
<xml_diff>
--- a/courts/fourth-circuit/virginia/state/court-of-appeals/amicus-brief/usage/OUTPUT-amicus-brief.docx
+++ b/courts/fourth-circuit/virginia/state/court-of-appeals/amicus-brief/usage/OUTPUT-amicus-brief.docx
@@ -1242,7 +1242,12 @@
     </w:p>
     <w:p>
       <w:pPr>
-        <w:spacing w:before="1440" w:after="0" w:line="322" w:lineRule="exact"/>
+        <w:spacing w:before="0" w:after="0" w:line="2691" w:lineRule="exact"/>
+      </w:pPr>
+    </w:p>
+    <w:p>
+      <w:pPr>
+        <w:spacing w:before="0" w:after="0" w:line="322" w:lineRule="exact"/>
         <w:ind w:left="4608" w:firstLine="0"/>
         <w:jc w:val="left"/>
       </w:pPr>
@@ -11618,13 +11623,7 @@
         <w:t xml:space="preserve"> </w:t>
       </w:r>
       <w:r>
-        <w:t xml:space="preserve">– submit this brief in support of Appellants. Amici (and their journalists and members) frequently utilize the Virginia Freedom of Information Act, Va. Code Ann. § 2.2</w:t>
-      </w:r>
-      <w:r>
-        <w:noBreakHyphen/>
-      </w:r>
-      <w:r>
-        <w:t xml:space="preserve">3700,</w:t>
+        <w:t xml:space="preserve">– submit this brief in support of Appellants. Amici (and their journalists and members) frequently utilize the Virginia Freedom of Information Act, Va. Code Ann. § 2.2-⁠3700,</w:t>
       </w:r>
       <w:r>
         <w:t xml:space="preserve"> </w:t>
@@ -11884,13 +11883,7 @@
         <w:pStyle w:val="BodyText"/>
       </w:pPr>
       <w:r>
-        <w:t xml:space="preserve">The goal of VFOIA is to ensure that “the affairs of government” not be “conducted in an atmosphere of secrecy” because the “public is . . . the beneficiary of any action taken at any level of government.” Va. Code Ann. § 2.2</w:t>
-      </w:r>
-      <w:r>
-        <w:noBreakHyphen/>
-      </w:r>
-      <w:r>
-        <w:t xml:space="preserve">3700(B).</w:t>
+        <w:t xml:space="preserve">The goal of VFOIA is to ensure that “the affairs of government” not be “conducted in an atmosphere of secrecy” because the “public is . . . the beneficiary of any action taken at any level of government.” Va. Code Ann. § 2.2-⁠3700(B).</w:t>
       </w:r>
       <w:r>
         <w:t xml:space="preserve"> </w:t>
@@ -11939,13 +11932,7 @@
         <w:t xml:space="preserve">v. Commw. Transp. Comm’r of Virginia</w:t>
       </w:r>
       <w:r>
-        <w:t xml:space="preserve">, 270 Va. 58, 64 (2005) (VFOIA is “salutary statutory scheme to provide freedom of information consistent with open government”). To serve that public interest, VFOIA provides presumptive access to all government records and unequivocally provides that its disclosure provisions must “be liberally construed” and its exemptions “narrowly construed.” Va. Code Ann. § 2.2</w:t>
-      </w:r>
-      <w:r>
-        <w:noBreakHyphen/>
-      </w:r>
-      <w:r>
-        <w:t xml:space="preserve">3700;</w:t>
+        <w:t xml:space="preserve">, 270 Va. 58, 64 (2005) (VFOIA is “salutary statutory scheme to provide freedom of information consistent with open government”). To serve that public interest, VFOIA provides presumptive access to all government records and unequivocally provides that its disclosure provisions must “be liberally construed” and its exemptions “narrowly construed.” Va. Code Ann. § 2.2-⁠3700;</w:t>
       </w:r>
       <w:r>
         <w:t xml:space="preserve"> </w:t>
@@ -12082,7 +12069,7 @@
         <w:t xml:space="preserve">Media Partners, LLC v. Dep’t of Crim. Just. Info. Servs.</w:t>
       </w:r>
       <w:r>
-        <w:t xml:space="preserve">, 140 N.E.3d 923, 933 (Mass. 2020) (courts “cannot read exemption[s] . . . so broadly” that they contravene the general rule of disclosure);</w:t>
+        <w:t xml:space="preserve">, 140 N.E.3d 923, 933 (Mass. 2020) (courts “cannot read exemption[s] . . . so broadly” that they contravene the general rule of disclosure);</w:t>
       </w:r>
       <w:r>
         <w:t xml:space="preserve"> </w:t>
@@ -12095,7 +12082,7 @@
         <w:t xml:space="preserve">N.J. Media Grp., Inc. v. Twp. of Lyndhurst</w:t>
       </w:r>
       <w:r>
-        <w:t xml:space="preserve">, 163 A.3d 887, 907 (N.J. 2017) (“The public’s interest in transparency favors disclosure . . . in matters of great public concern.”);</w:t>
+        <w:t xml:space="preserve">, 163 A.3d 887, 907 (N.J. 2017) (“The public’s interest in transparency favors disclosure . . . in matters of great public concern.”);</w:t>
       </w:r>
       <w:r>
         <w:t xml:space="preserve"> </w:t>
@@ -12130,13 +12117,7 @@
         <w:pStyle w:val="BodyText"/>
       </w:pPr>
       <w:r>
-        <w:t xml:space="preserve">In short, VFOIA must be interpreted with an eye toward the goal of maximum public disclosure, particularly where disclosure serves a significant public interest. The Circuit Court failed to do this when it broadly interpreted VFOIA § 2.2</w:t>
-      </w:r>
-      <w:r>
-        <w:noBreakHyphen/>
-      </w:r>
-      <w:r>
-        <w:t xml:space="preserve">3706(B)⁠(4) so as to fully shield the requested audio recordings from public review. The lower court’s overbroad reading of the phrase “records of persons imprisoned” threatens not only the public’s access to records about the implementation of the death penalty (which has a long history of openness), but also its access to records about how the government operates prisons more generally. This cannot be what VFOIA intends.</w:t>
+        <w:t xml:space="preserve">In short, VFOIA must be interpreted with an eye toward the goal of maximum public disclosure, particularly where disclosure serves a significant public interest. The Circuit Court failed to do this when it broadly interpreted VFOIA § 2.2-⁠3706(B)⁠(4) so as to fully shield the requested audio recordings from public review. The lower court’s overbroad reading of the phrase “records of persons imprisoned” threatens not only the public’s access to records about the implementation of the death penalty (which has a long history of openness), but also its access to records about how the government operates prisons more generally. This cannot be what VFOIA intends.</w:t>
       </w:r>
     </w:p>
     <w:p>
@@ -12632,7 +12613,7 @@
         <w:t xml:space="preserve">see also Cal. First Amend. Coal. v. Woodford</w:t>
       </w:r>
       <w:r>
-        <w:t xml:space="preserve">, 299 F.3d 868, 875 (9th Cir. 2002) (“Executions were fully open events in the United States . . . .”). For example, the press reported that a “thousand people” witnessed the 1902 execution of George Robinson in Virginia.</w:t>
+        <w:t xml:space="preserve">, 299 F.3d 868, 875 (9th Cir. 2002) (“Executions were fully open events in the United States . . . .”). For example, the press reported that a “thousand people” witnessed the 1902 execution of George Robinson in Virginia.</w:t>
       </w:r>
       <w:r>
         <w:t xml:space="preserve"> </w:t>
@@ -12645,7 +12626,7 @@
         <w:t xml:space="preserve">George Robinson Hanged</w:t>
       </w:r>
       <w:r>
-        <w:t xml:space="preserve">, Balt. Sun, Aug. 2, 1902, at 9, available at http://tinyurl.com/44hcscbh.</w:t>
+        <w:t xml:space="preserve">, Balt. Sun, Aug. 2, 1902, at 9, available at http://​tinyurl.​com/​44hcscbh.</w:t>
       </w:r>
     </w:p>
     <w:p>
@@ -12733,7 +12714,7 @@
         <w:t xml:space="preserve">Feb. 13, 1906: Minnesota’s Last Execution</w:t>
       </w:r>
       <w:r>
-        <w:t xml:space="preserve">, Star Tribune (May 1, 2014), http://tinyurl.com/267uen34.</w:t>
+        <w:t xml:space="preserve">, Star Tribune (May 1, 2014), http://​tinyurl.​com/​267uen34.</w:t>
       </w:r>
       <w:r>
         <w:t xml:space="preserve"> </w:t>
@@ -12755,7 +12736,7 @@
         <w:t xml:space="preserve"> </w:t>
       </w:r>
       <w:r>
-        <w:t xml:space="preserve">Reports about the incident “ignited a movement . . . to abolish capital punishment,” and governors commuted every death sentence imposed in Minnesota until the death penalty was abolished five years later.</w:t>
+        <w:t xml:space="preserve">Reports about the incident “ignited a movement . . . to abolish capital punishment,” and governors commuted every death sentence imposed in Minnesota until the death penalty was abolished five years later.</w:t>
       </w:r>
       <w:r>
         <w:t xml:space="preserve"> </w:t>
@@ -12851,7 +12832,7 @@
         <w:t xml:space="preserve">1911</w:t>
       </w:r>
       <w:r>
-        <w:t xml:space="preserve">, 22 Wm. Mitchell L. Rev. 577, 700 (1996) (“[T]he newspapers that exposed the gruesome details of Williams’ execution . . . made it Minnesota’s last hanging.”).</w:t>
+        <w:t xml:space="preserve">, 22 Wm. Mitchell L. Rev. 577, 700 (1996) (“[T]he newspapers that exposed the gruesome details of Williams’ execution . . . made it Minnesota’s last hanging.”).</w:t>
       </w:r>
     </w:p>
     <w:p>
@@ -12867,7 +12848,7 @@
         <w:pStyle w:val="BodyText"/>
       </w:pPr>
       <w:r>
-        <w:t xml:space="preserve">In Florida, the publication of photographs of the 1999 electric chair execution of Allen Lee Davis “whipped up renewed passion in an old debate that . . . signal[ed] the end of the electric chair in Florida and perhaps the rest of the nation.” Rick Bragg,</w:t>
+        <w:t xml:space="preserve">In Florida, the publication of photographs of the 1999 electric chair execution of Allen Lee Davis “whipped up renewed passion in an old debate that . . . signal[ed] the end of the electric chair in Florida and perhaps the rest of the nation.” Rick Bragg,</w:t>
       </w:r>
       <w:r>
         <w:t xml:space="preserve"> </w:t>
@@ -12880,7 +12861,7 @@
         <w:t xml:space="preserve">Florida’s Messy Executions Put the Electric Chair on Trial</w:t>
       </w:r>
       <w:r>
-        <w:t xml:space="preserve">, N.Y. Times (Nov. 18, 1999), http://tinyurl.com/4shfumka.</w:t>
+        <w:t xml:space="preserve">, N.Y. Times (Nov. 18, 1999), http://​tinyurl.​com/​4shfumka.</w:t>
       </w:r>
       <w:r>
         <w:t xml:space="preserve"> </w:t>
@@ -12952,7 +12933,7 @@
         <w:t xml:space="preserve">Botched Oklahoma Execution Reignites Death Penalty Debate</w:t>
       </w:r>
       <w:r>
-        <w:t xml:space="preserve">, Wash. Post (Apr. 30, 2014), http://tinyurl.com/​hjkyev55.</w:t>
+        <w:t xml:space="preserve">, Wash. Post (Apr. 30, 2014), http://​tinyurl.​com/​hjkyev55.</w:t>
       </w:r>
       <w:r>
         <w:t xml:space="preserve"> </w:t>
@@ -12971,7 +12952,7 @@
         <w:t xml:space="preserve">Reporters Committee Attorneys Help Win Oklahoma Lawsuit over Delayed Release of Records Related to 2014 Botched Execution</w:t>
       </w:r>
       <w:r>
-        <w:t xml:space="preserve">, Reporters’ Comm. for Freedom of the Press (Apr. 23, 2018), http://tinyurl.com/4hepu42r;</w:t>
+        <w:t xml:space="preserve">, Reporters’ Comm. for Freedom of the Press (Apr. 23, 2018), http://​tinyurl.​com/​4hepu42r;</w:t>
       </w:r>
       <w:r>
         <w:t xml:space="preserve"> </w:t>
@@ -13000,7 +12981,7 @@
         <w:t xml:space="preserve">How Oklahoma’s Botched Execution Affects the Death Penalty Debate</w:t>
       </w:r>
       <w:r>
-        <w:t xml:space="preserve">, The Atlantic (Apr. 30, 2018), http://tinyurl.com/​mryna6bb.</w:t>
+        <w:t xml:space="preserve">, The Atlantic (Apr. 30, 2018), http://​tinyurl.​com/​mryna6bb.</w:t>
       </w:r>
     </w:p>
     <w:p>
@@ -13034,7 +13015,7 @@
         <w:t xml:space="preserve">Reporter Describes Arizona Execution: 2 Hours, 640 Gasps</w:t>
       </w:r>
       <w:r>
-        <w:t xml:space="preserve">, Ariz. Republic (Nov. 6, 2014), http://tinyurl.com/​tuwab7sb,</w:t>
+        <w:t xml:space="preserve">, Ariz. Republic (Nov. 6, 2014), http://​tinyurl.​com/​tuwab7sb,</w:t>
       </w:r>
       <w:r>
         <w:t xml:space="preserve"> </w:t>
@@ -13069,7 +13050,7 @@
         <w:t xml:space="preserve">Arizona Governor Won’t Proceed with Execution Set by Court</w:t>
       </w:r>
       <w:r>
-        <w:t xml:space="preserve">, Associated Press (Mar. 3, 2023), http://tinyurl.com/2s4bz6fb.</w:t>
+        <w:t xml:space="preserve">, Associated Press (Mar. 3, 2023), http://​tinyurl.​com/​2s4bz6fb.</w:t>
       </w:r>
     </w:p>
     <w:p>
@@ -13090,7 +13071,7 @@
         <w:t xml:space="preserve">Dead to Rights: What Did the State of Alabama Do to Joe Nathan James in the Three Hours Before His Execution?</w:t>
       </w:r>
       <w:r>
-        <w:t xml:space="preserve">, The Atlantic (Aug. 14, 2022), http://tinyurl.com/5ct2x75s.</w:t>
+        <w:t xml:space="preserve">, The Atlantic (Aug. 14, 2022), http://​tinyurl.​com/​5ct2x75s.</w:t>
       </w:r>
       <w:r>
         <w:t xml:space="preserve"> </w:t>
@@ -13106,10 +13087,24 @@
           <w:i/>
           <w:iCs/>
         </w:rPr>
-        <w:t xml:space="preserve">Alabama Pausing Executions After 3rd Failed Lethal Injection</w:t>
-      </w:r>
-      <w:r>
-        <w:t xml:space="preserve">, Associated Press (Nov. 21, 2022), http://tinyurl.com/2jz8akcx.</w:t>
+        <w:t xml:space="preserve">Alabama Pausing Executions</w:t>
+      </w:r>
+      <w:r>
+        <w:rPr>
+          <w:i/>
+          <w:iCs/>
+        </w:rPr>
+        <w:t xml:space="preserve"> </w:t>
+      </w:r>
+      <w:r>
+        <w:rPr>
+          <w:i/>
+          <w:iCs/>
+        </w:rPr>
+        <w:t xml:space="preserve">After 3rd Failed Lethal Injection</w:t>
+      </w:r>
+      <w:r>
+        <w:t xml:space="preserve">, Associated Press (Nov. 21, 2022), http://​tinyurl.​com/​2jz8akcx.</w:t>
       </w:r>
     </w:p>
     <w:p>
@@ -13163,7 +13158,7 @@
         <w:t xml:space="preserve">Store Clerk’s Killer Executed in Virginia</w:t>
       </w:r>
       <w:r>
-        <w:t xml:space="preserve">, N.Y. Times (Jan. 25, 1996), http://tinyurl.com/3s278pvd,</w:t>
+        <w:t xml:space="preserve">, N.Y. Times (Jan. 25, 1996), http://​tinyurl.​com/​3s278pvd,</w:t>
       </w:r>
       <w:r>
         <w:t xml:space="preserve"> </w:t>
@@ -13182,7 +13177,7 @@
         <w:t xml:space="preserve">Executed: Ricky Gray Put to Death for Murders of Harvey Girls</w:t>
       </w:r>
       <w:r>
-        <w:t xml:space="preserve">, Richmond Times-Dispatch (Jan. 19, 2017), http://tinyurl.com/4smah3st.</w:t>
+        <w:t xml:space="preserve">, Richmond Times-Dispatch (Jan. 19, 2017), http://​tinyurl.​com/​4smah3st.</w:t>
       </w:r>
       <w:r>
         <w:t xml:space="preserve"> </w:t>
@@ -13217,7 +13212,7 @@
         <w:t xml:space="preserve">Virginia, with 2nd-Most Executions, Outlaws Death Penalty</w:t>
       </w:r>
       <w:r>
-        <w:t xml:space="preserve">, Associated Press (Mar. 24, 2021), http://tinyurl.com/​mr245jzt.</w:t>
+        <w:t xml:space="preserve">, Associated Press (Mar. 24, 2021), http://​tinyurl.​com/​mr245jzt.</w:t>
       </w:r>
     </w:p>
     <w:p>
@@ -13290,7 +13285,7 @@
         <w:noBreakHyphen/>
       </w:r>
       <w:r>
-        <w:t xml:space="preserve">9 (D. Ariz. Oct. 7, 2013) (providing information “to the public” about how the death penalty is implemented “furthers the . . . goal of an informed public debate”);</w:t>
+        <w:t xml:space="preserve">9 (D. Ariz. Oct. 7, 2013) (providing information “to the public” about how the death penalty is implemented “furthers the . . . goal of an informed public debate”);</w:t>
       </w:r>
       <w:r>
         <w:t xml:space="preserve"> </w:t>
@@ -13411,7 +13406,7 @@
         <w:t xml:space="preserve">Why It’s So Significant Virginia Just Abolished the Death Penalty</w:t>
       </w:r>
       <w:r>
-        <w:t xml:space="preserve">, Time (March 4, 2021), http://tinyurl.com/​yw27cvhe</w:t>
+        <w:t xml:space="preserve">, Time (March 4, 2021), http://​tinyurl.​com/​yw27cvhe</w:t>
       </w:r>
       <w:r>
         <w:t xml:space="preserve"> </w:t>
@@ -13665,7 +13660,7 @@
         <w:t xml:space="preserve">The Economic Burden of Incarceration in the U.S.</w:t>
       </w:r>
       <w:r>
-        <w:t xml:space="preserve">, Inst. for Just. Rsch. &amp; Dev. (2016), http://tinyurl.com/​e2e5hudh</w:t>
+        <w:t xml:space="preserve">, Inst. for Just. Rsch. &amp; Dev. (2016), http://​tinyurl.​com/​e2e5hudh</w:t>
       </w:r>
       <w:r>
         <w:t xml:space="preserve"> </w:t>
@@ -13700,7 +13695,7 @@
         <w:t xml:space="preserve">Lifetime Risk of Imprisonment in the United States Remains High and Starkly Unequal</w:t>
       </w:r>
       <w:r>
-        <w:t xml:space="preserve">, Science (Dec. 2, 2022), http://tinyurl.com/5n7b9br8.</w:t>
+        <w:t xml:space="preserve">, Science (Dec. 2, 2022), http://​tinyurl.​com/​5n7b9br8.</w:t>
       </w:r>
       <w:r>
         <w:t xml:space="preserve"> </w:t>
@@ -13751,7 +13746,7 @@
         <w:t xml:space="preserve">Documents Show Problems with Medical Care, Supervision and Violence at Ohio Prison</w:t>
       </w:r>
       <w:r>
-        <w:t xml:space="preserve">, Columbus Dispatch (Oct. 29, 2021), http://tinyurl.com/​yck3puw4.</w:t>
+        <w:t xml:space="preserve">, Columbus Dispatch (Oct. 29, 2021), http://​tinyurl.​com/​yck3puw4.</w:t>
       </w:r>
     </w:p>
     <w:p>
@@ -13785,10 +13780,24 @@
           <w:i/>
           <w:iCs/>
         </w:rPr>
-        <w:t xml:space="preserve">A Jail Increased Extreme Isolation to Stop Suicides. More People Killed Themselves</w:t>
-      </w:r>
-      <w:r>
-        <w:t xml:space="preserve">, ProPublica (Nov. 5, 2019), http://tinyurl.com/​bdehcfd7.</w:t>
+        <w:t xml:space="preserve">A Jail Increased Extreme Isolation</w:t>
+      </w:r>
+      <w:r>
+        <w:rPr>
+          <w:i/>
+          <w:iCs/>
+        </w:rPr>
+        <w:t xml:space="preserve"> </w:t>
+      </w:r>
+      <w:r>
+        <w:rPr>
+          <w:i/>
+          <w:iCs/>
+        </w:rPr>
+        <w:t xml:space="preserve">to Stop Suicides. More People Killed Themselves</w:t>
+      </w:r>
+      <w:r>
+        <w:t xml:space="preserve">, ProPublica (Nov. 5, 2019), http://​tinyurl.​com/​bdehcfd7.</w:t>
       </w:r>
     </w:p>
     <w:p>
@@ -13809,7 +13818,7 @@
         <w:t xml:space="preserve">Behind the Violence at Rikers, Decades of Mismanagement and Dysfunction</w:t>
       </w:r>
       <w:r>
-        <w:t xml:space="preserve">, N.Y. Times (Dec. 21, 2021), http://tinyurl.com/3jpsupbm.</w:t>
+        <w:t xml:space="preserve">, N.Y. Times (Dec. 21, 2021), http://​tinyurl.​com/​3jpsupbm.</w:t>
       </w:r>
       <w:r>
         <w:t xml:space="preserve"> </w:t>
@@ -13841,7 +13850,7 @@
         <w:t xml:space="preserve">City Council Passes Bill to Restore Reentry Services to Trans Women on Rikers Island</w:t>
       </w:r>
       <w:r>
-        <w:t xml:space="preserve">, The City (June 8, 2023), http://tinyurl.com/​yc4zhpex,</w:t>
+        <w:t xml:space="preserve">, The City (June 8, 2023), http://​tinyurl.​com/​yc4zhpex,</w:t>
       </w:r>
       <w:r>
         <w:t xml:space="preserve"> </w:t>
@@ -13876,7 +13885,7 @@
         <w:t xml:space="preserve">Federal Prosecutor Asks Judge to Strip New York of Control over Rikers</w:t>
       </w:r>
       <w:r>
-        <w:t xml:space="preserve">, N.Y. Times (Nov. 18, 2023), http://tinyurl.com/4xe3a4wv.</w:t>
+        <w:t xml:space="preserve">, N.Y. Times (Nov. 18, 2023), http://​tinyurl.​com/​4xe3a4wv.</w:t>
       </w:r>
     </w:p>
     <w:p>
@@ -13913,7 +13922,7 @@
         <w:t xml:space="preserve">How the Newest Federal Prison Became One of the Deadliest</w:t>
       </w:r>
       <w:r>
-        <w:t xml:space="preserve">, Marshall Project (May 31, 2022), http://tinyurl.com/277zh69t;</w:t>
+        <w:t xml:space="preserve">, Marshall Project (May 31, 2022), http://​tinyurl.​com/​277zh69t;</w:t>
       </w:r>
       <w:r>
         <w:t xml:space="preserve"> </w:t>
@@ -13926,7 +13935,7 @@
         <w:t xml:space="preserve">Impact</w:t>
       </w:r>
       <w:r>
-        <w:t xml:space="preserve">, Marshall Project, http://tinyurl.com/4vsv4h9z.</w:t>
+        <w:t xml:space="preserve">, Marshall Project, http://​tinyurl.​com/​4vsv4h9z.</w:t>
       </w:r>
     </w:p>
     <w:p>
@@ -13947,7 +13956,7 @@
         <w:t xml:space="preserve">As the Pandemic Swept America, Deaths in Prison Rose Nearly 50 Percent</w:t>
       </w:r>
       <w:r>
-        <w:t xml:space="preserve">, N.Y. Times (Feb. 19, 2023), http://tinyurl.com/​yck75mvy.</w:t>
+        <w:t xml:space="preserve">, N.Y. Times (Feb. 19, 2023), http://​tinyurl.​com/​yck75mvy.</w:t>
       </w:r>
       <w:r>
         <w:t xml:space="preserve"> </w:t>
@@ -13979,7 +13988,7 @@
         <w:t xml:space="preserve">see also UCLA Law Researchers Find Prison Mortality Rates Skyrocketed Nationwide During Pandemic</w:t>
       </w:r>
       <w:r>
-        <w:t xml:space="preserve">, UCLA Newsroom (Feb. 19, 2023), http://tinyurl.com/​y36drahf</w:t>
+        <w:t xml:space="preserve">, UCLA Newsroom (Feb. 19, 2023), http://​tinyurl.​com/​y36drahf</w:t>
       </w:r>
       <w:r>
         <w:t xml:space="preserve"> </w:t>
@@ -14255,13 +14264,7 @@
         <w:pStyle w:val="BodyText"/>
       </w:pPr>
       <w:r>
-        <w:t xml:space="preserve">The Circuit Court ignored the longstanding and crucial role of records like those Appellants seek in facilitating democratic oversight, which is precisely VFOIA’s purpose. The ruling below prevents the public from auditorily “witness[ing] the operations of government,” Va. Code Ann. § 2.2</w:t>
-      </w:r>
-      <w:r>
-        <w:noBreakHyphen/>
-      </w:r>
-      <w:r>
-        <w:t xml:space="preserve">3700(B),</w:t>
+        <w:t xml:space="preserve">The Circuit Court ignored the longstanding and crucial role of records like those Appellants seek in facilitating democratic oversight, which is precisely VFOIA’s purpose. The ruling below prevents the public from auditorily “witness[ing] the operations of government,” Va. Code Ann. § 2.2-⁠3700(B),</w:t>
       </w:r>
       <w:r>
         <w:t xml:space="preserve"> </w:t>
@@ -14310,13 +14313,7 @@
         <w:t xml:space="preserve"> </w:t>
       </w:r>
       <w:r>
-        <w:t xml:space="preserve">Va. Code Ann. § 2.2</w:t>
-      </w:r>
-      <w:r>
-        <w:noBreakHyphen/>
-      </w:r>
-      <w:r>
-        <w:t xml:space="preserve">3700.</w:t>
+        <w:t xml:space="preserve">Va. Code Ann. § 2.2-⁠3700.</w:t>
       </w:r>
     </w:p>
     <w:p>
@@ -14353,7 +14350,7 @@
         <w:t xml:space="preserve">Alabama AG Calls First Nitrogen Gas Execution ‘Textbook,’ but Witnesses Say Inmate Thrashed in Final Moment</w:t>
       </w:r>
       <w:r>
-        <w:t xml:space="preserve">, NBC News (Jan. 26, 2024), http://tinyurl.com/4jwf5k46.</w:t>
+        <w:t xml:space="preserve">, NBC News (Jan. 26, 2024), http://​tinyurl.​com/​4jwf5k46.</w:t>
       </w:r>
       <w:r>
         <w:t xml:space="preserve"> </w:t>
@@ -14393,7 +14390,7 @@
         <w:t xml:space="preserve">Families of Executed Prisoners Want Death Penalty Tapes Made Public</w:t>
       </w:r>
       <w:r>
-        <w:t xml:space="preserve">, NPR (Dec. 20, 2023), http://tinyurl.com/7ey6j5m6.</w:t>
+        <w:t xml:space="preserve">, NPR (Dec. 20, 2023), http://​tinyurl.​com/​7ey6j5m6.</w:t>
       </w:r>
       <w:r>
         <w:t xml:space="preserve"> </w:t>
@@ -15332,7 +15329,7 @@
         <w:t xml:space="preserve">Execution Costs Spike in Virginia</w:t>
       </w:r>
       <w:r>
-        <w:t xml:space="preserve">, Associated Press (Dec. 12, 2016), http://tinyurl.com/2keabxtf;</w:t>
+        <w:t xml:space="preserve">, Associated Press (Dec. 12, 2016), http://​tinyurl.​com/​2keabxtf;</w:t>
       </w:r>
       <w:r>
         <w:t xml:space="preserve"> </w:t>
@@ -15351,7 +15348,7 @@
         <w:t xml:space="preserve">A $6,300 Bus. A $33 Last Meal. What New Documents Tell Us About Trump’s Execution Spree</w:t>
       </w:r>
       <w:r>
-        <w:t xml:space="preserve">, Marshall Project (Jan. 14, 2021), http://tinyurl.com/4xabew4w.</w:t>
+        <w:t xml:space="preserve">, Marshall Project (Jan. 14, 2021), http://​tinyurl.​com/​4xabew4w.</w:t>
       </w:r>
       <w:r>
         <w:t xml:space="preserve"> </w:t>
@@ -16099,6 +16096,7 @@
     <w:unhideWhenUsed/>
     <w:qFormat/>
     <w:pPr>
+      <w:keepLines/>
       <w:spacing w:before="0" w:after="140" w:line="322" w:lineRule="exact"/>
     </w:pPr>
     <w:rPr>
@@ -16349,6 +16347,33 @@
     <w:pPr>
       <w:spacing w:before="0" w:after="0" w:line="322" w:lineRule="exact"/>
       <w:ind w:left="2160" w:hanging="720"/>
+    </w:pPr>
+  </w:style>
+  <w:style w:type="paragraph" w:customStyle="1" w:styleId="XdQuoteList1">
+    <w:name w:val="Xd Quote List 1"/>
+    <w:basedOn w:val="Normal"/>
+    <w:qFormat/>
+    <w:pPr>
+      <w:spacing w:before="0" w:after="0" w:line="322" w:lineRule="exact"/>
+      <w:ind w:left="1440" w:right="720" w:hanging="720"/>
+    </w:pPr>
+  </w:style>
+  <w:style w:type="paragraph" w:customStyle="1" w:styleId="XdQuoteList2">
+    <w:name w:val="Xd Quote List 2"/>
+    <w:basedOn w:val="Normal"/>
+    <w:qFormat/>
+    <w:pPr>
+      <w:spacing w:before="0" w:after="0" w:line="322" w:lineRule="exact"/>
+      <w:ind w:left="2160" w:right="720" w:hanging="720"/>
+    </w:pPr>
+  </w:style>
+  <w:style w:type="paragraph" w:customStyle="1" w:styleId="XdQuoteList3">
+    <w:name w:val="Xd Quote List 3"/>
+    <w:basedOn w:val="Normal"/>
+    <w:qFormat/>
+    <w:pPr>
+      <w:spacing w:before="0" w:after="0" w:line="322" w:lineRule="exact"/>
+      <w:ind w:left="2880" w:right="720" w:hanging="720"/>
     </w:pPr>
   </w:style>
   <w:style w:type="paragraph" w:customStyle="1" w:styleId="SourceCode">

</xml_diff>